<commit_message>
Italian Part 4: final continuity pass on 54-56 (shipping, letter date); rebuild Part 4 book; Part 5 story bible
Co-Authored-By: Claude Opus 5.5 <noreply@anthropic.com>
Claude-Session: https://claude.ai/code/session_014Pwa4fJotSRvNewqVrvk7U
</commit_message>
<xml_diff>
--- a/business_it/part4/ep54_Chiara_da_sola.docx
+++ b/business_it/part4/ep54_Chiara_da_sola.docx
@@ -488,7 +488,7 @@
           <w:color w:val="666666"/>
           <w:sz w:val="19"/>
         </w:rPr>
-        <w:t>Il laboratorio è ancora buio. Chiara accende solo la lampada sul banco di Renzo: un mazzo di chiavi su una striscia di cuoio consumata: laboratorio, magazzino delle pelli, armadio di Ugo. Renzo lo lasciò sul banco di lei nove giorni fa, alle 18.40; la mattina dopo lei l'ha riportato qui, sul suo. Sul banco accanto, quaranta borse in fila, ventidue finite, diciotto Ponte ancora senza bordo: i bordi sono di Simone. Il colore è il grigio quasi azzurro che Loredana ha tinto da sola e che lei ha chiamato « dopo la pioggia ». Renzo diceva: « un grigio che ha paura di essere azzurro ». Sul foglio di lavoro appeso alla lampada, quattro colonne: Simone, Loredana, Chiara, « R.? ».</w:t>
+        <w:t>Il laboratorio è ancora buio. Chiara accende solo la lampada sul banco di Renzo: un mazzo di chiavi su una striscia di cuoio consumata: laboratorio, magazzino delle pelli, armadio di Ugo. Renzo lo lasciò sul banco di lei nove giorni fa, alle 18.40; la mattina dopo lei l'ha riportato qui, sul suo. Sul banco accanto, quaranta borse in fila, ventidue finite, diciotto ancora senza bordo: otto Badia e i dieci Ponte, quelli con la tracolla più corta di sei centimetri. I bordi dei Ponte sono di Simone. Il colore è il grigio quasi azzurro che Loredana ha tinto da sola e che lei ha chiamato « dopo la pioggia ». Renzo diceva: « un grigio che ha paura di essere azzurro ». Sul foglio di lavoro appeso alla lampada, quattro colonne: Simone, Loredana, Chiara, « R.? ».</w:t>
       </w:r>
     </w:p>
     <w:p>
@@ -800,7 +800,7 @@
           <w:sz w:val="22"/>
         </w:rPr>
         <w:tab/>
-        <w:t>Il furgone di Fabbri passa alle sei di stasera. Volo domani da Malpensa, lunedì mattina a Seul. Il quindici. Non un giorno dopo.</w:t>
+        <w:t>Il furgone di Fabbri passa alle sei di stasera. Volo stanotte da Malpensa, lunedì mattina a Seul. Il quindici. Non un giorno dopo.</w:t>
       </w:r>
     </w:p>
     <w:p>
@@ -1882,7 +1882,7 @@
           <w:sz w:val="22"/>
         </w:rPr>
         <w:tab/>
-        <w:t>Ho parlato con Fabbri. Volo cargo domani alle quattordici da Malpensa. Arrivo a Incheon lunedì alle nove e mezza, ora di Seul.</w:t>
+        <w:t>Ho parlato con Fabbri. Volo cargo stanotte alle ventitré e cinquanta da Malpensa, con uno scalo. Arrivo a Incheon lunedì alle nove e mezza, ora di Seul. Margine: zero.</w:t>
       </w:r>
     </w:p>
     <w:p>
@@ -1986,7 +1986,7 @@
           <w:sz w:val="22"/>
         </w:rPr>
         <w:tab/>
-        <w:t>Milleottocento euro. Con la nave sarebbero stati trecento.</w:t>
+        <w:t>Milleottocento euro. Metà la paga la signora Kim, come avevamo deciso ad agosto. Con la nave sarebbero stati trecento.</w:t>
       </w:r>
     </w:p>
     <w:p>
@@ -7855,7 +7855,7 @@
           <w:color w:val="666666"/>
           <w:sz w:val="19"/>
         </w:rPr>
-        <w:t>공방은 아직 어둡다. 키아라는 렌초의 작업대 위 램프만 켠다. 닳은 가죽끈에 꿴 열쇠 꾸러미가 있다. 공방, 가죽 창고, 우고의 장. 9일 전 저녁 6시 40분 렌초가 그녀의 작업대에 두고 간 것을, 다음 날 아침 그녀가 여기, 그의 작업대로 옮겨 놓았다. 옆 작업대에는 가방 40개가 줄지어 있다. 22개는 완성, 18개의 폰테는 아직 가장자리 마감 전이다. 가장자리는 시모네 몫이다. 색은 로레다나가 혼자 염색한, 그녀가 '비 온 뒤'라고 이름 붙인 거의 하늘색에 가까운 회색이다. 렌초는 '하늘색이 될까 봐 겁내는 회색'이라고 했다. 램프에 걸린 작업표에는 칸이 네 개다. 시모네, 로레다나, 키아라, 'R.?'.</w:t>
+        <w:t>공방은 아직 어둡다. 키아라는 렌초의 작업대 위 램프만 켠다. 닳은 가죽끈에 꿴 열쇠 꾸러미가 있다. 공방, 가죽 창고, 우고의 장. 9일 전 저녁 6시 40분 렌초가 그녀의 작업대에 두고 간 것을, 다음 날 아침 그녀가 여기, 그의 작업대로 옮겨 놓았다. 옆 작업대에는 가방 40개가 줄지어 있다. 22개는 완성, 18개는 아직 가장자리 마감 전이다. 바디아 8개, 그리고 끈이 6센티 짧은 폰테 10개. 폰테의 가장자리는 시모네 몫이다. 색은 로레다나가 혼자 염색한, 그녀가 '비 온 뒤'라고 이름 붙인 거의 하늘색에 가까운 회색이다. 렌초는 '하늘색이 될까 봐 겁내는 회색'이라고 했다. 램프에 걸린 작업표에는 칸이 네 개다. 시모네, 로레다나, 키아라, 'R.?'.</w:t>
       </w:r>
     </w:p>
     <w:p>
@@ -8167,7 +8167,7 @@
           <w:sz w:val="21"/>
         </w:rPr>
         <w:tab/>
-        <w:t>파브리 화물차가 오늘 저녁 6시에 와. 내일 말펜사에서 비행기, 월요일 아침 서울. 15일이야. 하루도 늦으면 안 돼.</w:t>
+        <w:t>파브리 화물차가 오늘 저녁 6시에 와. 오늘 밤 말펜사에서 비행기, 월요일 아침 서울. 15일이야. 하루도 늦으면 안 돼.</w:t>
       </w:r>
     </w:p>
     <w:p>
@@ -9251,7 +9251,7 @@
           <w:sz w:val="21"/>
         </w:rPr>
         <w:tab/>
-        <w:t>파브리랑 통화했어. 내일 오후 2시 말펜사발 화물기. 인천 도착은 월요일 오전 9시 반, 서울 시간으로.</w:t>
+        <w:t>파브리랑 통화했어. 오늘 밤 11시 50분 말펜사발 화물기, 한 번 경유해. 인천 도착은 월요일 오전 9시 반, 서울 시간으로. 여유는 0.</w:t>
       </w:r>
     </w:p>
     <w:p>
@@ -9355,7 +9355,7 @@
           <w:sz w:val="21"/>
         </w:rPr>
         <w:tab/>
-        <w:t>1,800유로. 배였으면 300유로였을 거야.</w:t>
+        <w:t>1,800유로. 8월에 정한 대로 절반은 김 차장님이 내. 배였으면 300유로였을 거야.</w:t>
       </w:r>
     </w:p>
     <w:p>

</xml_diff>